<commit_message>
Fixed problem with CD-ROM confirmation template. Removed WSP from 'Recorded' table Override subject line of Confirmation of Registration when tenant is DES
</commit_message>
<xml_diff>
--- a/CUWebinars.Web/App_Data/mergeTemplates/OrderSubmitted_PreEventForOnDemandOnly.docx
+++ b/CUWebinars.Web/App_Data/mergeTemplates/OrderSubmitted_PreEventForOnDemandOnly.docx
@@ -17,10 +17,10 @@
         <w:tblLook w:val="04A0" w:firstRow="1" w:lastRow="0" w:firstColumn="1" w:lastColumn="0" w:noHBand="0" w:noVBand="1"/>
       </w:tblPr>
       <w:tblGrid>
-        <w:gridCol w:w="262"/>
-        <w:gridCol w:w="6000"/>
+        <w:gridCol w:w="265"/>
+        <w:gridCol w:w="6305"/>
         <w:gridCol w:w="2835"/>
-        <w:gridCol w:w="263"/>
+        <w:gridCol w:w="265"/>
       </w:tblGrid>
       <w:tr>
         <w:tc>
@@ -313,8 +313,6 @@
                       <w:szCs w:val="18"/>
                     </w:rPr>
                   </w:pPr>
-                  <w:bookmarkStart w:id="1" w:name="_GoBack"/>
-                  <w:bookmarkEnd w:id="1"/>
                   <w:r>
                     <w:rPr>
                       <w:color w:val="7F7F7F" w:themeColor="text1" w:themeTint="80"/>
@@ -582,9 +580,9 @@
             <w:r>
               <w:t xml:space="preserve"> </w:t>
             </w:r>
-            <w:bookmarkStart w:id="2" w:name="OLE_LINK1"/>
-            <w:bookmarkStart w:id="3" w:name="OLE_LINK2"/>
-            <w:bookmarkStart w:id="4" w:name="OLE_LINK3"/>
+            <w:bookmarkStart w:id="1" w:name="OLE_LINK1"/>
+            <w:bookmarkStart w:id="2" w:name="OLE_LINK2"/>
+            <w:bookmarkStart w:id="3" w:name="OLE_LINK3"/>
             <w:r>
               <w:rPr>
                 <w:i/>
@@ -616,14 +614,23 @@
               </w:rPr>
               <w:fldChar w:fldCharType="end"/>
             </w:r>
+            <w:bookmarkEnd w:id="1"/>
             <w:bookmarkEnd w:id="2"/>
             <w:bookmarkEnd w:id="3"/>
-            <w:bookmarkEnd w:id="4"/>
             <w:r>
               <w:t>!</w:t>
             </w:r>
             <w:r>
-              <w:t xml:space="preserve"> We’ll be sending you another notification with complete playback details as soon as the recording is posted.</w:t>
+              <w:rPr>
+                <w:rFonts w:ascii="Calibri" w:hAnsi="Calibri"/>
+              </w:rPr>
+              <w:t xml:space="preserve"> Your registration includes online access to the recording and handouts for six (6) months. </w:t>
+            </w:r>
+            <w:r>
+              <w:t xml:space="preserve">Watch your email for a </w:t>
+            </w:r>
+            <w:r>
+              <w:t>notification with complete playback details as soon as the recording is posted.</w:t>
             </w:r>
           </w:p>
           <w:p/>
@@ -632,7 +639,21 @@
               <w:rPr>
                 <w:noProof/>
               </w:rPr>
-              <w:t>If you would like to update your order to include attending the live event, please</w:t>
+              <w:t>If you would like to update your order to include the live event</w:t>
+            </w:r>
+            <w:r>
+              <w:rPr>
+                <w:noProof/>
+              </w:rPr>
+              <w:t xml:space="preserve"> or add a CD-ROM</w:t>
+            </w:r>
+            <w:bookmarkStart w:id="4" w:name="_GoBack"/>
+            <w:bookmarkEnd w:id="4"/>
+            <w:r>
+              <w:rPr>
+                <w:noProof/>
+              </w:rPr>
+              <w:t xml:space="preserve"> please</w:t>
             </w:r>
             <w:r>
               <w:rPr>
@@ -1120,6 +1141,7 @@
     <w:lsdException w:name="HTML Sample" w:semiHidden="1" w:unhideWhenUsed="1"/>
     <w:lsdException w:name="HTML Typewriter" w:semiHidden="1" w:unhideWhenUsed="1"/>
     <w:lsdException w:name="HTML Variable" w:semiHidden="1" w:unhideWhenUsed="1"/>
+    <w:lsdException w:name="Normal Table" w:semiHidden="1" w:unhideWhenUsed="1"/>
     <w:lsdException w:name="annotation subject" w:semiHidden="1" w:unhideWhenUsed="1"/>
     <w:lsdException w:name="No List" w:semiHidden="1" w:unhideWhenUsed="1"/>
     <w:lsdException w:name="Outline List 1" w:semiHidden="1" w:unhideWhenUsed="1"/>
@@ -1166,8 +1188,10 @@
     <w:lsdException w:name="Table Subtle 2" w:semiHidden="1" w:unhideWhenUsed="1"/>
     <w:lsdException w:name="Table Web 1" w:semiHidden="1" w:unhideWhenUsed="1"/>
     <w:lsdException w:name="Table Web 2" w:semiHidden="1" w:unhideWhenUsed="1"/>
+    <w:lsdException w:name="Table Web 3" w:semiHidden="1" w:unhideWhenUsed="1"/>
     <w:lsdException w:name="Balloon Text" w:semiHidden="1" w:unhideWhenUsed="1"/>
     <w:lsdException w:name="Table Grid" w:uiPriority="39"/>
+    <w:lsdException w:name="Table Theme" w:semiHidden="1" w:unhideWhenUsed="1"/>
     <w:lsdException w:name="Placeholder Text" w:semiHidden="1"/>
     <w:lsdException w:name="No Spacing" w:uiPriority="1" w:qFormat="1"/>
     <w:lsdException w:name="Light Shading" w:uiPriority="60"/>
@@ -1760,7 +1784,7 @@
 </file>
 
 <file path=customXml/itemProps1.xml><?xml version="1.0" encoding="utf-8"?>
-<ds:datastoreItem xmlns:ds="http://schemas.openxmlformats.org/officeDocument/2006/customXml" ds:itemID="{BF02825A-BE11-4537-B8DB-9AA73FB6416A}">
+<ds:datastoreItem xmlns:ds="http://schemas.openxmlformats.org/officeDocument/2006/customXml" ds:itemID="{009E3E7B-720A-4082-8724-E13B2315986F}">
   <ds:schemaRefs>
     <ds:schemaRef ds:uri="http://schemas.openxmlformats.org/officeDocument/2006/bibliography"/>
   </ds:schemaRefs>

</xml_diff>